<commit_message>
docs: Update Kapak_3.docx, Kapak_4.docx, and Kapak_5.docx.
</commit_message>
<xml_diff>
--- a/Kapak_3.docx
+++ b/Kapak_3.docx
@@ -935,16 +935,7 @@
                 <w:sz w:val="16"/>
                 <w:szCs w:val="16"/>
               </w:rPr>
-              <w:t xml:space="preserve"> </w:t>
-            </w:r>
-            <w:r>
-              <w:rPr>
-                <w:bCs/>
-                <w:iCs/>
-                <w:sz w:val="16"/>
-                <w:szCs w:val="16"/>
-              </w:rPr>
-              <w:t xml:space="preserve"> </w:t>
+              <w:t xml:space="preserve">  </w:t>
             </w:r>
             <w:r>
               <w:rPr>
@@ -2443,20 +2434,6 @@
         </w:tc>
       </w:tr>
     </w:tbl>
-    <w:p>
-      <w:pPr>
-        <w:pStyle w:val="TOCHeading"/>
-        <w:spacing w:line="360" w:lineRule="auto"/>
-        <w:rPr>
-          <w:rFonts w:ascii="Times New Roman" w:hAnsi="Times New Roman"/>
-          <w:b/>
-          <w:bCs/>
-          <w:color w:val="auto"/>
-          <w:sz w:val="28"/>
-          <w:szCs w:val="28"/>
-        </w:rPr>
-      </w:pPr>
-    </w:p>
     <w:p>
       <w:pPr>
         <w:pStyle w:val="TOCHeading"/>
@@ -8852,6 +8829,7 @@
   <w:style w:type="character" w:default="1" w:styleId="DefaultParagraphFont">
     <w:name w:val="Default Paragraph Font"/>
     <w:uiPriority w:val="1"/>
+    <w:semiHidden/>
     <w:unhideWhenUsed/>
   </w:style>
   <w:style w:type="table" w:default="1" w:styleId="TableNormal">

</xml_diff>